<commit_message>
agrego data urbano rural del censo 2001
</commit_message>
<xml_diff>
--- a/Output/Old/att_blank.docx
+++ b/Output/Old/att_blank.docx
@@ -28,7 +28,7 @@
               <w:pStyle w:val="Compact"/>
               <w:spacing w:after="0"/>
               <w:rPr>
-                <w:rFonts w:ascii="Times New Roman" w:hAnsi="Times New Roman" w:cs="Times New Roman"/>
+                <w:rFonts w:ascii="Cambria" w:hAnsi="Cambria" w:cs="Times New Roman"/>
               </w:rPr>
             </w:pPr>
           </w:p>
@@ -43,12 +43,12 @@
               <w:spacing w:after="0"/>
               <w:jc w:val="center"/>
               <w:rPr>
-                <w:rFonts w:ascii="Times New Roman" w:hAnsi="Times New Roman" w:cs="Times New Roman"/>
-              </w:rPr>
-            </w:pPr>
-            <w:r>
-              <w:rPr>
-                <w:rFonts w:ascii="Times New Roman" w:hAnsi="Times New Roman" w:cs="Times New Roman"/>
+                <w:rFonts w:ascii="Cambria" w:hAnsi="Cambria" w:cs="Times New Roman"/>
+              </w:rPr>
+            </w:pPr>
+            <w:r>
+              <w:rPr>
+                <w:rFonts w:ascii="Cambria" w:hAnsi="Cambria" w:cs="Times New Roman"/>
               </w:rPr>
               <w:t>Share of blank votes</w:t>
             </w:r>
@@ -69,7 +69,7 @@
               <w:pStyle w:val="Compact"/>
               <w:spacing w:after="0"/>
               <w:rPr>
-                <w:rFonts w:ascii="Times New Roman" w:hAnsi="Times New Roman" w:cs="Times New Roman"/>
+                <w:rFonts w:ascii="Cambria" w:hAnsi="Cambria" w:cs="Times New Roman"/>
               </w:rPr>
             </w:pPr>
           </w:p>
@@ -83,12 +83,12 @@
               <w:spacing w:after="0"/>
               <w:jc w:val="center"/>
               <w:rPr>
-                <w:rFonts w:ascii="Times New Roman" w:hAnsi="Times New Roman" w:cs="Times New Roman"/>
-              </w:rPr>
-            </w:pPr>
-            <w:r>
-              <w:rPr>
-                <w:rFonts w:ascii="Times New Roman" w:hAnsi="Times New Roman" w:cs="Times New Roman"/>
+                <w:rFonts w:ascii="Cambria" w:hAnsi="Cambria" w:cs="Times New Roman"/>
+              </w:rPr>
+            </w:pPr>
+            <w:r>
+              <w:rPr>
+                <w:rFonts w:ascii="Cambria" w:hAnsi="Cambria" w:cs="Times New Roman"/>
               </w:rPr>
               <w:t>(1)</w:t>
             </w:r>
@@ -103,12 +103,12 @@
               <w:spacing w:after="0"/>
               <w:jc w:val="center"/>
               <w:rPr>
-                <w:rFonts w:ascii="Times New Roman" w:hAnsi="Times New Roman" w:cs="Times New Roman"/>
-              </w:rPr>
-            </w:pPr>
-            <w:r>
-              <w:rPr>
-                <w:rFonts w:ascii="Times New Roman" w:hAnsi="Times New Roman" w:cs="Times New Roman"/>
+                <w:rFonts w:ascii="Cambria" w:hAnsi="Cambria" w:cs="Times New Roman"/>
+              </w:rPr>
+            </w:pPr>
+            <w:r>
+              <w:rPr>
+                <w:rFonts w:ascii="Cambria" w:hAnsi="Cambria" w:cs="Times New Roman"/>
               </w:rPr>
               <w:t>(2)</w:t>
             </w:r>
@@ -124,12 +124,12 @@
             <w:pPr>
               <w:pStyle w:val="Compact"/>
               <w:rPr>
-                <w:rFonts w:ascii="Times New Roman" w:hAnsi="Times New Roman" w:cs="Times New Roman"/>
-              </w:rPr>
-            </w:pPr>
-            <w:r>
-              <w:rPr>
-                <w:rFonts w:ascii="Times New Roman" w:hAnsi="Times New Roman" w:cs="Times New Roman"/>
+                <w:rFonts w:ascii="Cambria" w:hAnsi="Cambria" w:cs="Times New Roman"/>
+              </w:rPr>
+            </w:pPr>
+            <w:r>
+              <w:rPr>
+                <w:rFonts w:ascii="Cambria" w:hAnsi="Cambria" w:cs="Times New Roman"/>
               </w:rPr>
               <w:t>Post × Spanish share (1936-1955)</w:t>
             </w:r>
@@ -144,12 +144,12 @@
               <w:pStyle w:val="Compact"/>
               <w:jc w:val="center"/>
               <w:rPr>
-                <w:rFonts w:ascii="Times New Roman" w:hAnsi="Times New Roman" w:cs="Times New Roman"/>
-              </w:rPr>
-            </w:pPr>
-            <w:r>
-              <w:rPr>
-                <w:rFonts w:ascii="Times New Roman" w:hAnsi="Times New Roman" w:cs="Times New Roman"/>
+                <w:rFonts w:ascii="Cambria" w:hAnsi="Cambria" w:cs="Times New Roman"/>
+              </w:rPr>
+            </w:pPr>
+            <w:r>
+              <w:rPr>
+                <w:rFonts w:ascii="Cambria" w:hAnsi="Cambria" w:cs="Times New Roman"/>
               </w:rPr>
               <w:t>-2.112**</w:t>
             </w:r>
@@ -164,12 +164,12 @@
               <w:pStyle w:val="Compact"/>
               <w:jc w:val="center"/>
               <w:rPr>
-                <w:rFonts w:ascii="Times New Roman" w:hAnsi="Times New Roman" w:cs="Times New Roman"/>
-              </w:rPr>
-            </w:pPr>
-            <w:r>
-              <w:rPr>
-                <w:rFonts w:ascii="Times New Roman" w:hAnsi="Times New Roman" w:cs="Times New Roman"/>
+                <w:rFonts w:ascii="Cambria" w:hAnsi="Cambria" w:cs="Times New Roman"/>
+              </w:rPr>
+            </w:pPr>
+            <w:r>
+              <w:rPr>
+                <w:rFonts w:ascii="Cambria" w:hAnsi="Cambria" w:cs="Times New Roman"/>
               </w:rPr>
               <w:t>-1.881***</w:t>
             </w:r>
@@ -185,7 +185,7 @@
             <w:pPr>
               <w:pStyle w:val="Compact"/>
               <w:rPr>
-                <w:rFonts w:ascii="Times New Roman" w:hAnsi="Times New Roman" w:cs="Times New Roman"/>
+                <w:rFonts w:ascii="Cambria" w:hAnsi="Cambria" w:cs="Times New Roman"/>
               </w:rPr>
             </w:pPr>
           </w:p>
@@ -199,12 +199,12 @@
               <w:pStyle w:val="Compact"/>
               <w:jc w:val="center"/>
               <w:rPr>
-                <w:rFonts w:ascii="Times New Roman" w:hAnsi="Times New Roman" w:cs="Times New Roman"/>
-              </w:rPr>
-            </w:pPr>
-            <w:r>
-              <w:rPr>
-                <w:rFonts w:ascii="Times New Roman" w:hAnsi="Times New Roman" w:cs="Times New Roman"/>
+                <w:rFonts w:ascii="Cambria" w:hAnsi="Cambria" w:cs="Times New Roman"/>
+              </w:rPr>
+            </w:pPr>
+            <w:r>
+              <w:rPr>
+                <w:rFonts w:ascii="Cambria" w:hAnsi="Cambria" w:cs="Times New Roman"/>
               </w:rPr>
               <w:t>(0.843)</w:t>
             </w:r>
@@ -219,12 +219,12 @@
               <w:pStyle w:val="Compact"/>
               <w:jc w:val="center"/>
               <w:rPr>
-                <w:rFonts w:ascii="Times New Roman" w:hAnsi="Times New Roman" w:cs="Times New Roman"/>
-              </w:rPr>
-            </w:pPr>
-            <w:r>
-              <w:rPr>
-                <w:rFonts w:ascii="Times New Roman" w:hAnsi="Times New Roman" w:cs="Times New Roman"/>
+                <w:rFonts w:ascii="Cambria" w:hAnsi="Cambria" w:cs="Times New Roman"/>
+              </w:rPr>
+            </w:pPr>
+            <w:r>
+              <w:rPr>
+                <w:rFonts w:ascii="Cambria" w:hAnsi="Cambria" w:cs="Times New Roman"/>
               </w:rPr>
               <w:t>(0.549)</w:t>
             </w:r>
@@ -240,12 +240,12 @@
             <w:pPr>
               <w:pStyle w:val="Compact"/>
               <w:rPr>
-                <w:rFonts w:ascii="Times New Roman" w:hAnsi="Times New Roman" w:cs="Times New Roman"/>
-              </w:rPr>
-            </w:pPr>
-            <w:r>
-              <w:rPr>
-                <w:rFonts w:ascii="Times New Roman" w:hAnsi="Times New Roman" w:cs="Times New Roman"/>
+                <w:rFonts w:ascii="Cambria" w:hAnsi="Cambria" w:cs="Times New Roman"/>
+              </w:rPr>
+            </w:pPr>
+            <w:r>
+              <w:rPr>
+                <w:rFonts w:ascii="Cambria" w:hAnsi="Cambria" w:cs="Times New Roman"/>
               </w:rPr>
               <w:t>Post × Spanish share (1956-1978)</w:t>
             </w:r>
@@ -260,12 +260,12 @@
               <w:pStyle w:val="Compact"/>
               <w:jc w:val="center"/>
               <w:rPr>
-                <w:rFonts w:ascii="Times New Roman" w:hAnsi="Times New Roman" w:cs="Times New Roman"/>
-              </w:rPr>
-            </w:pPr>
-            <w:r>
-              <w:rPr>
-                <w:rFonts w:ascii="Times New Roman" w:hAnsi="Times New Roman" w:cs="Times New Roman"/>
+                <w:rFonts w:ascii="Cambria" w:hAnsi="Cambria" w:cs="Times New Roman"/>
+              </w:rPr>
+            </w:pPr>
+            <w:r>
+              <w:rPr>
+                <w:rFonts w:ascii="Cambria" w:hAnsi="Cambria" w:cs="Times New Roman"/>
               </w:rPr>
               <w:t>-4.285*</w:t>
             </w:r>
@@ -280,12 +280,12 @@
               <w:pStyle w:val="Compact"/>
               <w:jc w:val="center"/>
               <w:rPr>
-                <w:rFonts w:ascii="Times New Roman" w:hAnsi="Times New Roman" w:cs="Times New Roman"/>
-              </w:rPr>
-            </w:pPr>
-            <w:r>
-              <w:rPr>
-                <w:rFonts w:ascii="Times New Roman" w:hAnsi="Times New Roman" w:cs="Times New Roman"/>
+                <w:rFonts w:ascii="Cambria" w:hAnsi="Cambria" w:cs="Times New Roman"/>
+              </w:rPr>
+            </w:pPr>
+            <w:r>
+              <w:rPr>
+                <w:rFonts w:ascii="Cambria" w:hAnsi="Cambria" w:cs="Times New Roman"/>
               </w:rPr>
               <w:t>-2.498</w:t>
             </w:r>
@@ -301,7 +301,7 @@
             <w:pPr>
               <w:pStyle w:val="Compact"/>
               <w:rPr>
-                <w:rFonts w:ascii="Times New Roman" w:hAnsi="Times New Roman" w:cs="Times New Roman"/>
+                <w:rFonts w:ascii="Cambria" w:hAnsi="Cambria" w:cs="Times New Roman"/>
               </w:rPr>
             </w:pPr>
           </w:p>
@@ -315,12 +315,12 @@
               <w:pStyle w:val="Compact"/>
               <w:jc w:val="center"/>
               <w:rPr>
-                <w:rFonts w:ascii="Times New Roman" w:hAnsi="Times New Roman" w:cs="Times New Roman"/>
-              </w:rPr>
-            </w:pPr>
-            <w:r>
-              <w:rPr>
-                <w:rFonts w:ascii="Times New Roman" w:hAnsi="Times New Roman" w:cs="Times New Roman"/>
+                <w:rFonts w:ascii="Cambria" w:hAnsi="Cambria" w:cs="Times New Roman"/>
+              </w:rPr>
+            </w:pPr>
+            <w:r>
+              <w:rPr>
+                <w:rFonts w:ascii="Cambria" w:hAnsi="Cambria" w:cs="Times New Roman"/>
               </w:rPr>
               <w:t>(2.238)</w:t>
             </w:r>
@@ -335,12 +335,12 @@
               <w:pStyle w:val="Compact"/>
               <w:jc w:val="center"/>
               <w:rPr>
-                <w:rFonts w:ascii="Times New Roman" w:hAnsi="Times New Roman" w:cs="Times New Roman"/>
-              </w:rPr>
-            </w:pPr>
-            <w:r>
-              <w:rPr>
-                <w:rFonts w:ascii="Times New Roman" w:hAnsi="Times New Roman" w:cs="Times New Roman"/>
+                <w:rFonts w:ascii="Cambria" w:hAnsi="Cambria" w:cs="Times New Roman"/>
+              </w:rPr>
+            </w:pPr>
+            <w:r>
+              <w:rPr>
+                <w:rFonts w:ascii="Cambria" w:hAnsi="Cambria" w:cs="Times New Roman"/>
               </w:rPr>
               <w:t>(2.285)</w:t>
             </w:r>
@@ -356,7 +356,7 @@
             <w:pPr>
               <w:pStyle w:val="Compact"/>
               <w:rPr>
-                <w:rFonts w:ascii="Times New Roman" w:hAnsi="Times New Roman" w:cs="Times New Roman"/>
+                <w:rFonts w:ascii="Cambria" w:hAnsi="Cambria" w:cs="Times New Roman"/>
               </w:rPr>
             </w:pPr>
           </w:p>
@@ -370,7 +370,7 @@
               <w:pStyle w:val="Compact"/>
               <w:jc w:val="center"/>
               <w:rPr>
-                <w:rFonts w:ascii="Times New Roman" w:hAnsi="Times New Roman" w:cs="Times New Roman"/>
+                <w:rFonts w:ascii="Cambria" w:hAnsi="Cambria" w:cs="Times New Roman"/>
               </w:rPr>
             </w:pPr>
           </w:p>
@@ -384,7 +384,7 @@
               <w:pStyle w:val="Compact"/>
               <w:jc w:val="center"/>
               <w:rPr>
-                <w:rFonts w:ascii="Times New Roman" w:hAnsi="Times New Roman" w:cs="Times New Roman"/>
+                <w:rFonts w:ascii="Cambria" w:hAnsi="Cambria" w:cs="Times New Roman"/>
               </w:rPr>
             </w:pPr>
           </w:p>
@@ -399,12 +399,12 @@
             <w:pPr>
               <w:pStyle w:val="Compact"/>
               <w:rPr>
-                <w:rFonts w:ascii="Times New Roman" w:hAnsi="Times New Roman" w:cs="Times New Roman"/>
-              </w:rPr>
-            </w:pPr>
-            <w:r>
-              <w:rPr>
-                <w:rFonts w:ascii="Times New Roman" w:hAnsi="Times New Roman" w:cs="Times New Roman"/>
+                <w:rFonts w:ascii="Cambria" w:hAnsi="Cambria" w:cs="Times New Roman"/>
+              </w:rPr>
+            </w:pPr>
+            <w:r>
+              <w:rPr>
+                <w:rFonts w:ascii="Cambria" w:hAnsi="Cambria" w:cs="Times New Roman"/>
               </w:rPr>
               <w:t>Observations</w:t>
             </w:r>
@@ -419,24 +419,24 @@
               <w:pStyle w:val="Compact"/>
               <w:jc w:val="center"/>
               <w:rPr>
-                <w:rFonts w:ascii="Times New Roman" w:hAnsi="Times New Roman" w:cs="Times New Roman"/>
-              </w:rPr>
-            </w:pPr>
-            <w:r>
-              <w:rPr>
-                <w:rFonts w:ascii="Times New Roman" w:hAnsi="Times New Roman" w:cs="Times New Roman"/>
+                <w:rFonts w:ascii="Cambria" w:hAnsi="Cambria" w:cs="Times New Roman"/>
+              </w:rPr>
+            </w:pPr>
+            <w:r>
+              <w:rPr>
+                <w:rFonts w:ascii="Cambria" w:hAnsi="Cambria" w:cs="Times New Roman"/>
               </w:rPr>
               <w:t>4</w:t>
             </w:r>
             <w:r>
               <w:rPr>
-                <w:rFonts w:ascii="Times New Roman" w:hAnsi="Times New Roman" w:cs="Times New Roman"/>
+                <w:rFonts w:ascii="Cambria" w:hAnsi="Cambria" w:cs="Times New Roman"/>
               </w:rPr>
               <w:t>,</w:t>
             </w:r>
             <w:r>
               <w:rPr>
-                <w:rFonts w:ascii="Times New Roman" w:hAnsi="Times New Roman" w:cs="Times New Roman"/>
+                <w:rFonts w:ascii="Cambria" w:hAnsi="Cambria" w:cs="Times New Roman"/>
               </w:rPr>
               <w:t>680</w:t>
             </w:r>
@@ -451,24 +451,24 @@
               <w:pStyle w:val="Compact"/>
               <w:jc w:val="center"/>
               <w:rPr>
-                <w:rFonts w:ascii="Times New Roman" w:hAnsi="Times New Roman" w:cs="Times New Roman"/>
-              </w:rPr>
-            </w:pPr>
-            <w:r>
-              <w:rPr>
-                <w:rFonts w:ascii="Times New Roman" w:hAnsi="Times New Roman" w:cs="Times New Roman"/>
+                <w:rFonts w:ascii="Cambria" w:hAnsi="Cambria" w:cs="Times New Roman"/>
+              </w:rPr>
+            </w:pPr>
+            <w:r>
+              <w:rPr>
+                <w:rFonts w:ascii="Cambria" w:hAnsi="Cambria" w:cs="Times New Roman"/>
               </w:rPr>
               <w:t>2</w:t>
             </w:r>
             <w:r>
               <w:rPr>
-                <w:rFonts w:ascii="Times New Roman" w:hAnsi="Times New Roman" w:cs="Times New Roman"/>
+                <w:rFonts w:ascii="Cambria" w:hAnsi="Cambria" w:cs="Times New Roman"/>
               </w:rPr>
               <w:t>,</w:t>
             </w:r>
             <w:r>
               <w:rPr>
-                <w:rFonts w:ascii="Times New Roman" w:hAnsi="Times New Roman" w:cs="Times New Roman"/>
+                <w:rFonts w:ascii="Cambria" w:hAnsi="Cambria" w:cs="Times New Roman"/>
               </w:rPr>
               <w:t>496</w:t>
             </w:r>
@@ -484,12 +484,12 @@
             <w:pPr>
               <w:pStyle w:val="Compact"/>
               <w:rPr>
-                <w:rFonts w:ascii="Times New Roman" w:hAnsi="Times New Roman" w:cs="Times New Roman"/>
-              </w:rPr>
-            </w:pPr>
-            <w:r>
-              <w:rPr>
-                <w:rFonts w:ascii="Times New Roman" w:hAnsi="Times New Roman" w:cs="Times New Roman"/>
+                <w:rFonts w:ascii="Cambria" w:hAnsi="Cambria" w:cs="Times New Roman"/>
+              </w:rPr>
+            </w:pPr>
+            <w:r>
+              <w:rPr>
+                <w:rFonts w:ascii="Cambria" w:hAnsi="Cambria" w:cs="Times New Roman"/>
               </w:rPr>
               <w:t>Municipality FE</w:t>
             </w:r>
@@ -504,12 +504,12 @@
               <w:pStyle w:val="Compact"/>
               <w:jc w:val="center"/>
               <w:rPr>
-                <w:rFonts w:ascii="Times New Roman" w:hAnsi="Times New Roman" w:cs="Times New Roman"/>
-              </w:rPr>
-            </w:pPr>
-            <w:r>
-              <w:rPr>
-                <w:rFonts w:ascii="Times New Roman" w:hAnsi="Times New Roman" w:cs="Times New Roman"/>
+                <w:rFonts w:ascii="Cambria" w:hAnsi="Cambria" w:cs="Times New Roman"/>
+              </w:rPr>
+            </w:pPr>
+            <w:r>
+              <w:rPr>
+                <w:rFonts w:ascii="Cambria" w:hAnsi="Cambria" w:cs="Times New Roman"/>
               </w:rPr>
               <w:t>Yes</w:t>
             </w:r>
@@ -524,12 +524,12 @@
               <w:pStyle w:val="Compact"/>
               <w:jc w:val="center"/>
               <w:rPr>
-                <w:rFonts w:ascii="Times New Roman" w:hAnsi="Times New Roman" w:cs="Times New Roman"/>
-              </w:rPr>
-            </w:pPr>
-            <w:r>
-              <w:rPr>
-                <w:rFonts w:ascii="Times New Roman" w:hAnsi="Times New Roman" w:cs="Times New Roman"/>
+                <w:rFonts w:ascii="Cambria" w:hAnsi="Cambria" w:cs="Times New Roman"/>
+              </w:rPr>
+            </w:pPr>
+            <w:r>
+              <w:rPr>
+                <w:rFonts w:ascii="Cambria" w:hAnsi="Cambria" w:cs="Times New Roman"/>
               </w:rPr>
               <w:t>Yes</w:t>
             </w:r>
@@ -545,12 +545,12 @@
             <w:pPr>
               <w:pStyle w:val="Compact"/>
               <w:rPr>
-                <w:rFonts w:ascii="Times New Roman" w:hAnsi="Times New Roman" w:cs="Times New Roman"/>
-              </w:rPr>
-            </w:pPr>
-            <w:r>
-              <w:rPr>
-                <w:rFonts w:ascii="Times New Roman" w:hAnsi="Times New Roman" w:cs="Times New Roman"/>
+                <w:rFonts w:ascii="Cambria" w:hAnsi="Cambria" w:cs="Times New Roman"/>
+              </w:rPr>
+            </w:pPr>
+            <w:r>
+              <w:rPr>
+                <w:rFonts w:ascii="Cambria" w:hAnsi="Cambria" w:cs="Times New Roman"/>
               </w:rPr>
               <w:t>Time FE</w:t>
             </w:r>
@@ -565,12 +565,12 @@
               <w:pStyle w:val="Compact"/>
               <w:jc w:val="center"/>
               <w:rPr>
-                <w:rFonts w:ascii="Times New Roman" w:hAnsi="Times New Roman" w:cs="Times New Roman"/>
-              </w:rPr>
-            </w:pPr>
-            <w:r>
-              <w:rPr>
-                <w:rFonts w:ascii="Times New Roman" w:hAnsi="Times New Roman" w:cs="Times New Roman"/>
+                <w:rFonts w:ascii="Cambria" w:hAnsi="Cambria" w:cs="Times New Roman"/>
+              </w:rPr>
+            </w:pPr>
+            <w:r>
+              <w:rPr>
+                <w:rFonts w:ascii="Cambria" w:hAnsi="Cambria" w:cs="Times New Roman"/>
               </w:rPr>
               <w:t>Yes</w:t>
             </w:r>
@@ -585,12 +585,12 @@
               <w:pStyle w:val="Compact"/>
               <w:jc w:val="center"/>
               <w:rPr>
-                <w:rFonts w:ascii="Times New Roman" w:hAnsi="Times New Roman" w:cs="Times New Roman"/>
-              </w:rPr>
-            </w:pPr>
-            <w:r>
-              <w:rPr>
-                <w:rFonts w:ascii="Times New Roman" w:hAnsi="Times New Roman" w:cs="Times New Roman"/>
+                <w:rFonts w:ascii="Cambria" w:hAnsi="Cambria" w:cs="Times New Roman"/>
+              </w:rPr>
+            </w:pPr>
+            <w:r>
+              <w:rPr>
+                <w:rFonts w:ascii="Cambria" w:hAnsi="Cambria" w:cs="Times New Roman"/>
               </w:rPr>
               <w:t>Yes</w:t>
             </w:r>
@@ -606,12 +606,12 @@
             <w:pPr>
               <w:pStyle w:val="Compact"/>
               <w:rPr>
-                <w:rFonts w:ascii="Times New Roman" w:hAnsi="Times New Roman" w:cs="Times New Roman"/>
-              </w:rPr>
-            </w:pPr>
-            <w:r>
-              <w:rPr>
-                <w:rFonts w:ascii="Times New Roman" w:hAnsi="Times New Roman" w:cs="Times New Roman"/>
+                <w:rFonts w:ascii="Cambria" w:hAnsi="Cambria" w:cs="Times New Roman"/>
+              </w:rPr>
+            </w:pPr>
+            <w:r>
+              <w:rPr>
+                <w:rFonts w:ascii="Cambria" w:hAnsi="Cambria" w:cs="Times New Roman"/>
               </w:rPr>
               <w:t>Election type FE</w:t>
             </w:r>
@@ -626,12 +626,12 @@
               <w:pStyle w:val="Compact"/>
               <w:jc w:val="center"/>
               <w:rPr>
-                <w:rFonts w:ascii="Times New Roman" w:hAnsi="Times New Roman" w:cs="Times New Roman"/>
-              </w:rPr>
-            </w:pPr>
-            <w:r>
-              <w:rPr>
-                <w:rFonts w:ascii="Times New Roman" w:hAnsi="Times New Roman" w:cs="Times New Roman"/>
+                <w:rFonts w:ascii="Cambria" w:hAnsi="Cambria" w:cs="Times New Roman"/>
+              </w:rPr>
+            </w:pPr>
+            <w:r>
+              <w:rPr>
+                <w:rFonts w:ascii="Cambria" w:hAnsi="Cambria" w:cs="Times New Roman"/>
               </w:rPr>
               <w:t>Yes</w:t>
             </w:r>
@@ -646,12 +646,12 @@
               <w:pStyle w:val="Compact"/>
               <w:jc w:val="center"/>
               <w:rPr>
-                <w:rFonts w:ascii="Times New Roman" w:hAnsi="Times New Roman" w:cs="Times New Roman"/>
-              </w:rPr>
-            </w:pPr>
-            <w:r>
-              <w:rPr>
-                <w:rFonts w:ascii="Times New Roman" w:hAnsi="Times New Roman" w:cs="Times New Roman"/>
+                <w:rFonts w:ascii="Cambria" w:hAnsi="Cambria" w:cs="Times New Roman"/>
+              </w:rPr>
+            </w:pPr>
+            <w:r>
+              <w:rPr>
+                <w:rFonts w:ascii="Cambria" w:hAnsi="Cambria" w:cs="Times New Roman"/>
               </w:rPr>
               <w:t>No</w:t>
             </w:r>
@@ -670,12 +670,12 @@
             <w:pPr>
               <w:pStyle w:val="Compact"/>
               <w:rPr>
-                <w:rFonts w:ascii="Times New Roman" w:hAnsi="Times New Roman" w:cs="Times New Roman"/>
-              </w:rPr>
-            </w:pPr>
-            <w:r>
-              <w:rPr>
-                <w:rFonts w:ascii="Times New Roman" w:hAnsi="Times New Roman" w:cs="Times New Roman"/>
+                <w:rFonts w:ascii="Cambria" w:hAnsi="Cambria" w:cs="Times New Roman"/>
+              </w:rPr>
+            </w:pPr>
+            <w:r>
+              <w:rPr>
+                <w:rFonts w:ascii="Cambria" w:hAnsi="Cambria" w:cs="Times New Roman"/>
               </w:rPr>
               <w:t>General elections only</w:t>
             </w:r>
@@ -693,12 +693,12 @@
               <w:pStyle w:val="Compact"/>
               <w:jc w:val="center"/>
               <w:rPr>
-                <w:rFonts w:ascii="Times New Roman" w:hAnsi="Times New Roman" w:cs="Times New Roman"/>
-              </w:rPr>
-            </w:pPr>
-            <w:r>
-              <w:rPr>
-                <w:rFonts w:ascii="Times New Roman" w:hAnsi="Times New Roman" w:cs="Times New Roman"/>
+                <w:rFonts w:ascii="Cambria" w:hAnsi="Cambria" w:cs="Times New Roman"/>
+              </w:rPr>
+            </w:pPr>
+            <w:r>
+              <w:rPr>
+                <w:rFonts w:ascii="Cambria" w:hAnsi="Cambria" w:cs="Times New Roman"/>
               </w:rPr>
               <w:t>No</w:t>
             </w:r>
@@ -716,12 +716,12 @@
               <w:pStyle w:val="Compact"/>
               <w:jc w:val="center"/>
               <w:rPr>
-                <w:rFonts w:ascii="Times New Roman" w:hAnsi="Times New Roman" w:cs="Times New Roman"/>
-              </w:rPr>
-            </w:pPr>
-            <w:r>
-              <w:rPr>
-                <w:rFonts w:ascii="Times New Roman" w:hAnsi="Times New Roman" w:cs="Times New Roman"/>
+                <w:rFonts w:ascii="Cambria" w:hAnsi="Cambria" w:cs="Times New Roman"/>
+              </w:rPr>
+            </w:pPr>
+            <w:r>
+              <w:rPr>
+                <w:rFonts w:ascii="Cambria" w:hAnsi="Cambria" w:cs="Times New Roman"/>
               </w:rPr>
               <w:t>Yes</w:t>
             </w:r>
@@ -742,12 +742,16 @@
               <w:pStyle w:val="Compact"/>
               <w:jc w:val="center"/>
               <w:rPr>
-                <w:rFonts w:ascii="Times New Roman" w:hAnsi="Times New Roman" w:cs="Times New Roman"/>
-              </w:rPr>
-            </w:pPr>
-            <w:r>
-              <w:rPr>
-                <w:rFonts w:ascii="Times New Roman" w:hAnsi="Times New Roman" w:cs="Times New Roman"/>
+                <w:rFonts w:ascii="Cambria" w:hAnsi="Cambria" w:cs="Times New Roman"/>
+                <w:sz w:val="21"/>
+                <w:szCs w:val="21"/>
+              </w:rPr>
+            </w:pPr>
+            <w:r>
+              <w:rPr>
+                <w:rFonts w:ascii="Cambria" w:hAnsi="Cambria" w:cs="Times New Roman"/>
+                <w:sz w:val="21"/>
+                <w:szCs w:val="21"/>
               </w:rPr>
               <w:t>p &lt; 0.1, ** p &lt; 0.05, *** p &lt; 0.01</w:t>
             </w:r>
@@ -764,12 +768,16 @@
             <w:pPr>
               <w:pStyle w:val="Compact"/>
               <w:rPr>
-                <w:rFonts w:ascii="Times New Roman" w:hAnsi="Times New Roman" w:cs="Times New Roman"/>
-              </w:rPr>
-            </w:pPr>
-            <w:r>
-              <w:rPr>
-                <w:rFonts w:ascii="Times New Roman" w:hAnsi="Times New Roman" w:cs="Times New Roman"/>
+                <w:rFonts w:ascii="Cambria" w:hAnsi="Cambria" w:cs="Times New Roman"/>
+                <w:sz w:val="21"/>
+                <w:szCs w:val="21"/>
+              </w:rPr>
+            </w:pPr>
+            <w:r>
+              <w:rPr>
+                <w:rFonts w:ascii="Cambria" w:hAnsi="Cambria" w:cs="Times New Roman"/>
+                <w:sz w:val="21"/>
+                <w:szCs w:val="21"/>
               </w:rPr>
               <w:t>Standard errors clustered at the municipality level in parentheses.</w:t>
             </w:r>

</xml_diff>